<commit_message>
Adiciona capítulo Glossário e Siglas ao Product Report do StepGraph
Último capítulo, deliberadamente enxuto (6 termos: IPED, KPI,
Leaflet, MVNO/MNO, MVP, Interpolação Quadrática de Bézier),
proporcional ao escopo real do step/index.html — sem inflar com
termos de RAG/ML/normas setoriais que pertencem apenas ao StepGraph
MNO Edition externo, já registrado como fora de escopo no capítulo
de Ressalvas.
</commit_message>
<xml_diff>
--- a/docs/produtos/stepgraph-product-report.docx
+++ b/docs/produtos/stepgraph-product-report.docx
@@ -322,6 +322,31 @@
           <w:szCs w:val="22"/>
         </w:rPr>
         <w:t xml:space="preserve">	8</w:t>
+      </w:r>
+    </w:p>
+    <w:p>
+      <w:pPr>
+        <w:tabs>
+          <w:tab w:val="right" w:pos="9026" w:leader="dot"/>
+        </w:tabs>
+        <w:spacing w:after="100"/>
+        <w:ind w:left="0"/>
+      </w:pPr>
+      <w:r>
+        <w:rPr>
+          <w:b/>
+          <w:bCs/>
+          <w:sz w:val="22"/>
+          <w:szCs w:val="22"/>
+        </w:rPr>
+        <w:t xml:space="preserve">Glossário e Siglas</w:t>
+      </w:r>
+      <w:r>
+        <w:rPr>
+          <w:sz w:val="22"/>
+          <w:szCs w:val="22"/>
+        </w:rPr>
+        <w:t xml:space="preserve">	9</w:t>
       </w:r>
     </w:p>
     <w:p>
@@ -3992,6 +4017,787 @@
                 <w:szCs w:val="19"/>
               </w:rPr>
               <w:t xml:space="preserve">Não aplicável nesta versão do produto: o StepGraph, em step/index.html, não implementa nenhuma funcionalidade de Consulta Individual restrita nem qualquer forma de acesso a dado identificável de indivíduo — todos os fluxos são agregados por zona/persona, sem granularidade de assinante individual. Não há, portanto, capítulo de Base Legal a preencher para esta versão do produto, conforme previsto no padrão de documentação da Vísent para produtos sem esse tipo de funcionalidade.</w:t>
+            </w:r>
+          </w:p>
+        </w:tc>
+      </w:tr>
+    </w:tbl>
+    <w:p>
+      <w:pPr>
+        <w:pStyle w:val="Heading1"/>
+      </w:pPr>
+      <w:r>
+        <w:t xml:space="preserve">Glossário e Siglas</w:t>
+      </w:r>
+    </w:p>
+    <w:p>
+      <w:pPr>
+        <w:spacing w:after="200" w:before="0"/>
+        <w:jc w:val="both"/>
+      </w:pPr>
+      <w:r>
+        <w:rPr>
+          <w:b w:val="false"/>
+          <w:bCs w:val="false"/>
+          <w:i w:val="false"/>
+          <w:iCs w:val="false"/>
+        </w:rPr>
+        <w:t xml:space="preserve">Glossário propositalmente enxuto, proporcional ao escopo real do StepGraph nesta versão do repositório (step/index.html): um painel de fluxos de mobilidade com filtros de persona/horário, sem Assistente, RAG ou modelo estatístico — ver capítulo Ressalvas para a distinção frente ao StepGraph MNO Edition externo.</w:t>
+      </w:r>
+    </w:p>
+    <w:tbl>
+      <w:tblPr>
+        <w:tblW w:type="dxa" w:w="9360"/>
+        <w:tblBorders>
+          <w:top w:val="single" w:color="auto" w:sz="4"/>
+          <w:left w:val="single" w:color="auto" w:sz="4"/>
+          <w:bottom w:val="single" w:color="auto" w:sz="4"/>
+          <w:right w:val="single" w:color="auto" w:sz="4"/>
+          <w:insideH w:val="single" w:color="auto" w:sz="4"/>
+          <w:insideV w:val="single" w:color="auto" w:sz="4"/>
+        </w:tblBorders>
+      </w:tblPr>
+      <w:tblGrid>
+        <w:gridCol w:w="2100"/>
+        <w:gridCol w:w="1500"/>
+        <w:gridCol w:w="5760"/>
+      </w:tblGrid>
+      <w:tr>
+        <w:tc>
+          <w:tcPr>
+            <w:tcW w:type="dxa" w:w="2100"/>
+            <w:tcBorders>
+              <w:top w:val="single" w:color="CCCCCC" w:sz="4"/>
+              <w:left w:val="single" w:color="CCCCCC" w:sz="4"/>
+              <w:bottom w:val="single" w:color="CCCCCC" w:sz="4"/>
+              <w:right w:val="single" w:color="CCCCCC" w:sz="4"/>
+            </w:tcBorders>
+            <w:shd w:fill="1F4E79" w:val="clear"/>
+            <w:tcMar>
+              <w:top w:type="dxa" w:w="100"/>
+              <w:left w:type="dxa" w:w="120"/>
+              <w:bottom w:type="dxa" w:w="100"/>
+              <w:right w:type="dxa" w:w="120"/>
+            </w:tcMar>
+            <w:vAlign w:val="center"/>
+          </w:tcPr>
+          <w:p>
+            <w:pPr>
+              <w:jc w:val="left"/>
+            </w:pPr>
+            <w:r>
+              <w:rPr>
+                <w:b/>
+                <w:bCs/>
+                <w:i w:val="false"/>
+                <w:iCs w:val="false"/>
+                <w:color w:val="FFFFFF"/>
+                <w:sz w:val="19"/>
+                <w:szCs w:val="19"/>
+              </w:rPr>
+              <w:t xml:space="preserve">Termo</w:t>
+            </w:r>
+          </w:p>
+        </w:tc>
+        <w:tc>
+          <w:tcPr>
+            <w:tcW w:type="dxa" w:w="1500"/>
+            <w:tcBorders>
+              <w:top w:val="single" w:color="CCCCCC" w:sz="4"/>
+              <w:left w:val="single" w:color="CCCCCC" w:sz="4"/>
+              <w:bottom w:val="single" w:color="CCCCCC" w:sz="4"/>
+              <w:right w:val="single" w:color="CCCCCC" w:sz="4"/>
+            </w:tcBorders>
+            <w:shd w:fill="1F4E79" w:val="clear"/>
+            <w:tcMar>
+              <w:top w:type="dxa" w:w="100"/>
+              <w:left w:type="dxa" w:w="120"/>
+              <w:bottom w:type="dxa" w:w="100"/>
+              <w:right w:type="dxa" w:w="120"/>
+            </w:tcMar>
+            <w:vAlign w:val="center"/>
+          </w:tcPr>
+          <w:p>
+            <w:pPr>
+              <w:jc w:val="left"/>
+            </w:pPr>
+            <w:r>
+              <w:rPr>
+                <w:b/>
+                <w:bCs/>
+                <w:i w:val="false"/>
+                <w:iCs w:val="false"/>
+                <w:color w:val="FFFFFF"/>
+                <w:sz w:val="19"/>
+                <w:szCs w:val="19"/>
+              </w:rPr>
+              <w:t xml:space="preserve">Categoria</w:t>
+            </w:r>
+          </w:p>
+        </w:tc>
+        <w:tc>
+          <w:tcPr>
+            <w:tcW w:type="dxa" w:w="5760"/>
+            <w:tcBorders>
+              <w:top w:val="single" w:color="CCCCCC" w:sz="4"/>
+              <w:left w:val="single" w:color="CCCCCC" w:sz="4"/>
+              <w:bottom w:val="single" w:color="CCCCCC" w:sz="4"/>
+              <w:right w:val="single" w:color="CCCCCC" w:sz="4"/>
+            </w:tcBorders>
+            <w:shd w:fill="1F4E79" w:val="clear"/>
+            <w:tcMar>
+              <w:top w:type="dxa" w:w="100"/>
+              <w:left w:type="dxa" w:w="120"/>
+              <w:bottom w:type="dxa" w:w="100"/>
+              <w:right w:type="dxa" w:w="120"/>
+            </w:tcMar>
+            <w:vAlign w:val="center"/>
+          </w:tcPr>
+          <w:p>
+            <w:pPr>
+              <w:jc w:val="left"/>
+            </w:pPr>
+            <w:r>
+              <w:rPr>
+                <w:b/>
+                <w:bCs/>
+                <w:i w:val="false"/>
+                <w:iCs w:val="false"/>
+                <w:color w:val="FFFFFF"/>
+                <w:sz w:val="19"/>
+                <w:szCs w:val="19"/>
+              </w:rPr>
+              <w:t xml:space="preserve">Definição</w:t>
+            </w:r>
+          </w:p>
+        </w:tc>
+      </w:tr>
+      <w:tr>
+        <w:tc>
+          <w:tcPr>
+            <w:tcW w:type="dxa" w:w="2100"/>
+            <w:tcBorders>
+              <w:top w:val="single" w:color="CCCCCC" w:sz="4"/>
+              <w:left w:val="single" w:color="CCCCCC" w:sz="4"/>
+              <w:bottom w:val="single" w:color="CCCCCC" w:sz="4"/>
+              <w:right w:val="single" w:color="CCCCCC" w:sz="4"/>
+            </w:tcBorders>
+            <w:tcMar>
+              <w:top w:type="dxa" w:w="100"/>
+              <w:left w:type="dxa" w:w="120"/>
+              <w:bottom w:type="dxa" w:w="100"/>
+              <w:right w:type="dxa" w:w="120"/>
+            </w:tcMar>
+            <w:vAlign w:val="center"/>
+          </w:tcPr>
+          <w:p>
+            <w:pPr>
+              <w:jc w:val="left"/>
+            </w:pPr>
+            <w:r>
+              <w:rPr>
+                <w:b/>
+                <w:bCs/>
+                <w:i w:val="false"/>
+                <w:iCs w:val="false"/>
+                <w:sz w:val="19"/>
+                <w:szCs w:val="19"/>
+              </w:rPr>
+              <w:t xml:space="preserve">Interpolação Quadrática de Bézier</w:t>
+            </w:r>
+          </w:p>
+        </w:tc>
+        <w:tc>
+          <w:tcPr>
+            <w:tcW w:type="dxa" w:w="1500"/>
+            <w:tcBorders>
+              <w:top w:val="single" w:color="CCCCCC" w:sz="4"/>
+              <w:left w:val="single" w:color="CCCCCC" w:sz="4"/>
+              <w:bottom w:val="single" w:color="CCCCCC" w:sz="4"/>
+              <w:right w:val="single" w:color="CCCCCC" w:sz="4"/>
+            </w:tcBorders>
+            <w:tcMar>
+              <w:top w:type="dxa" w:w="100"/>
+              <w:left w:type="dxa" w:w="120"/>
+              <w:bottom w:type="dxa" w:w="100"/>
+              <w:right w:type="dxa" w:w="120"/>
+            </w:tcMar>
+            <w:vAlign w:val="center"/>
+          </w:tcPr>
+          <w:p>
+            <w:pPr>
+              <w:jc w:val="left"/>
+            </w:pPr>
+            <w:r>
+              <w:rPr>
+                <w:b w:val="false"/>
+                <w:bCs w:val="false"/>
+                <w:i w:val="false"/>
+                <w:iCs w:val="false"/>
+                <w:color w:val="4A6A8A"/>
+                <w:sz w:val="19"/>
+                <w:szCs w:val="19"/>
+              </w:rPr>
+              <w:t xml:space="preserve">Modelo/Técnica</w:t>
+            </w:r>
+          </w:p>
+        </w:tc>
+        <w:tc>
+          <w:tcPr>
+            <w:tcW w:type="dxa" w:w="5760"/>
+            <w:tcBorders>
+              <w:top w:val="single" w:color="CCCCCC" w:sz="4"/>
+              <w:left w:val="single" w:color="CCCCCC" w:sz="4"/>
+              <w:bottom w:val="single" w:color="CCCCCC" w:sz="4"/>
+              <w:right w:val="single" w:color="CCCCCC" w:sz="4"/>
+            </w:tcBorders>
+            <w:tcMar>
+              <w:top w:type="dxa" w:w="100"/>
+              <w:left w:type="dxa" w:w="120"/>
+              <w:bottom w:type="dxa" w:w="100"/>
+              <w:right w:type="dxa" w:w="120"/>
+            </w:tcMar>
+            <w:vAlign w:val="center"/>
+          </w:tcPr>
+          <w:p>
+            <w:pPr>
+              <w:jc w:val="left"/>
+            </w:pPr>
+            <w:r>
+              <w:rPr>
+                <w:b w:val="false"/>
+                <w:bCs w:val="false"/>
+                <w:i w:val="false"/>
+                <w:iCs w:val="false"/>
+                <w:sz w:val="19"/>
+                <w:szCs w:val="19"/>
+              </w:rPr>
+              <w:t xml:space="preserve">Técnica usada para curvar as rotas (polylines) do mapa de fluxos entre zonas de origem e destino.</w:t>
+            </w:r>
+          </w:p>
+        </w:tc>
+      </w:tr>
+      <w:tr>
+        <w:tc>
+          <w:tcPr>
+            <w:tcW w:type="dxa" w:w="2100"/>
+            <w:tcBorders>
+              <w:top w:val="single" w:color="CCCCCC" w:sz="4"/>
+              <w:left w:val="single" w:color="CCCCCC" w:sz="4"/>
+              <w:bottom w:val="single" w:color="CCCCCC" w:sz="4"/>
+              <w:right w:val="single" w:color="CCCCCC" w:sz="4"/>
+            </w:tcBorders>
+            <w:tcMar>
+              <w:top w:type="dxa" w:w="100"/>
+              <w:left w:type="dxa" w:w="120"/>
+              <w:bottom w:type="dxa" w:w="100"/>
+              <w:right w:type="dxa" w:w="120"/>
+            </w:tcMar>
+            <w:vAlign w:val="center"/>
+          </w:tcPr>
+          <w:p>
+            <w:pPr>
+              <w:jc w:val="left"/>
+            </w:pPr>
+            <w:r>
+              <w:rPr>
+                <w:b/>
+                <w:bCs/>
+                <w:i w:val="false"/>
+                <w:iCs w:val="false"/>
+                <w:sz w:val="19"/>
+                <w:szCs w:val="19"/>
+              </w:rPr>
+              <w:t xml:space="preserve">IPED</w:t>
+            </w:r>
+          </w:p>
+        </w:tc>
+        <w:tc>
+          <w:tcPr>
+            <w:tcW w:type="dxa" w:w="1500"/>
+            <w:tcBorders>
+              <w:top w:val="single" w:color="CCCCCC" w:sz="4"/>
+              <w:left w:val="single" w:color="CCCCCC" w:sz="4"/>
+              <w:bottom w:val="single" w:color="CCCCCC" w:sz="4"/>
+              <w:right w:val="single" w:color="CCCCCC" w:sz="4"/>
+            </w:tcBorders>
+            <w:tcMar>
+              <w:top w:type="dxa" w:w="100"/>
+              <w:left w:type="dxa" w:w="120"/>
+              <w:bottom w:type="dxa" w:w="100"/>
+              <w:right w:type="dxa" w:w="120"/>
+            </w:tcMar>
+            <w:vAlign w:val="center"/>
+          </w:tcPr>
+          <w:p>
+            <w:pPr>
+              <w:jc w:val="left"/>
+            </w:pPr>
+            <w:r>
+              <w:rPr>
+                <w:b w:val="false"/>
+                <w:bCs w:val="false"/>
+                <w:i w:val="false"/>
+                <w:iCs w:val="false"/>
+                <w:color w:val="4A6A8A"/>
+                <w:sz w:val="19"/>
+                <w:szCs w:val="19"/>
+              </w:rPr>
+              <w:t xml:space="preserve">Sigla</w:t>
+            </w:r>
+          </w:p>
+        </w:tc>
+        <w:tc>
+          <w:tcPr>
+            <w:tcW w:type="dxa" w:w="5760"/>
+            <w:tcBorders>
+              <w:top w:val="single" w:color="CCCCCC" w:sz="4"/>
+              <w:left w:val="single" w:color="CCCCCC" w:sz="4"/>
+              <w:bottom w:val="single" w:color="CCCCCC" w:sz="4"/>
+              <w:right w:val="single" w:color="CCCCCC" w:sz="4"/>
+            </w:tcBorders>
+            <w:tcMar>
+              <w:top w:type="dxa" w:w="100"/>
+              <w:left w:type="dxa" w:w="120"/>
+              <w:bottom w:type="dxa" w:w="100"/>
+              <w:right w:type="dxa" w:w="120"/>
+            </w:tcMar>
+            <w:vAlign w:val="center"/>
+          </w:tcPr>
+          <w:p>
+            <w:pPr>
+              <w:jc w:val="left"/>
+            </w:pPr>
+            <w:r>
+              <w:rPr>
+                <w:b w:val="false"/>
+                <w:bCs w:val="false"/>
+                <w:i w:val="false"/>
+                <w:iCs w:val="false"/>
+                <w:sz w:val="19"/>
+                <w:szCs w:val="19"/>
+              </w:rPr>
+              <w:t xml:space="preserve">Índice de qualidade fim-a-fim por corredor — citado apenas no card da versão externa StepGraph MNO Edition (stepvis.netlify.app); não implementado em step/index.html, a versão documentada neste repositório.</w:t>
+            </w:r>
+          </w:p>
+        </w:tc>
+      </w:tr>
+      <w:tr>
+        <w:tc>
+          <w:tcPr>
+            <w:tcW w:type="dxa" w:w="2100"/>
+            <w:tcBorders>
+              <w:top w:val="single" w:color="CCCCCC" w:sz="4"/>
+              <w:left w:val="single" w:color="CCCCCC" w:sz="4"/>
+              <w:bottom w:val="single" w:color="CCCCCC" w:sz="4"/>
+              <w:right w:val="single" w:color="CCCCCC" w:sz="4"/>
+            </w:tcBorders>
+            <w:tcMar>
+              <w:top w:type="dxa" w:w="100"/>
+              <w:left w:type="dxa" w:w="120"/>
+              <w:bottom w:type="dxa" w:w="100"/>
+              <w:right w:type="dxa" w:w="120"/>
+            </w:tcMar>
+            <w:vAlign w:val="center"/>
+          </w:tcPr>
+          <w:p>
+            <w:pPr>
+              <w:jc w:val="left"/>
+            </w:pPr>
+            <w:r>
+              <w:rPr>
+                <w:b/>
+                <w:bCs/>
+                <w:i w:val="false"/>
+                <w:iCs w:val="false"/>
+                <w:sz w:val="19"/>
+                <w:szCs w:val="19"/>
+              </w:rPr>
+              <w:t xml:space="preserve">KPI</w:t>
+            </w:r>
+          </w:p>
+        </w:tc>
+        <w:tc>
+          <w:tcPr>
+            <w:tcW w:type="dxa" w:w="1500"/>
+            <w:tcBorders>
+              <w:top w:val="single" w:color="CCCCCC" w:sz="4"/>
+              <w:left w:val="single" w:color="CCCCCC" w:sz="4"/>
+              <w:bottom w:val="single" w:color="CCCCCC" w:sz="4"/>
+              <w:right w:val="single" w:color="CCCCCC" w:sz="4"/>
+            </w:tcBorders>
+            <w:tcMar>
+              <w:top w:type="dxa" w:w="100"/>
+              <w:left w:type="dxa" w:w="120"/>
+              <w:bottom w:type="dxa" w:w="100"/>
+              <w:right w:type="dxa" w:w="120"/>
+            </w:tcMar>
+            <w:vAlign w:val="center"/>
+          </w:tcPr>
+          <w:p>
+            <w:pPr>
+              <w:jc w:val="left"/>
+            </w:pPr>
+            <w:r>
+              <w:rPr>
+                <w:b w:val="false"/>
+                <w:bCs w:val="false"/>
+                <w:i w:val="false"/>
+                <w:iCs w:val="false"/>
+                <w:color w:val="4A6A8A"/>
+                <w:sz w:val="19"/>
+                <w:szCs w:val="19"/>
+              </w:rPr>
+              <w:t xml:space="preserve">Sigla</w:t>
+            </w:r>
+          </w:p>
+        </w:tc>
+        <w:tc>
+          <w:tcPr>
+            <w:tcW w:type="dxa" w:w="5760"/>
+            <w:tcBorders>
+              <w:top w:val="single" w:color="CCCCCC" w:sz="4"/>
+              <w:left w:val="single" w:color="CCCCCC" w:sz="4"/>
+              <w:bottom w:val="single" w:color="CCCCCC" w:sz="4"/>
+              <w:right w:val="single" w:color="CCCCCC" w:sz="4"/>
+            </w:tcBorders>
+            <w:tcMar>
+              <w:top w:type="dxa" w:w="100"/>
+              <w:left w:type="dxa" w:w="120"/>
+              <w:bottom w:type="dxa" w:w="100"/>
+              <w:right w:type="dxa" w:w="120"/>
+            </w:tcMar>
+            <w:vAlign w:val="center"/>
+          </w:tcPr>
+          <w:p>
+            <w:pPr>
+              <w:jc w:val="left"/>
+            </w:pPr>
+            <w:r>
+              <w:rPr>
+                <w:b w:val="false"/>
+                <w:bCs w:val="false"/>
+                <w:i w:val="false"/>
+                <w:iCs w:val="false"/>
+                <w:sz w:val="19"/>
+                <w:szCs w:val="19"/>
+              </w:rPr>
+              <w:t xml:space="preserve">Key Performance Indicator — os 4 indicadores de topo do painel (deslocamentos no filtro, zona mais concentrada, persona dominante, precisão média de localização).</w:t>
+            </w:r>
+          </w:p>
+        </w:tc>
+      </w:tr>
+      <w:tr>
+        <w:tc>
+          <w:tcPr>
+            <w:tcW w:type="dxa" w:w="2100"/>
+            <w:tcBorders>
+              <w:top w:val="single" w:color="CCCCCC" w:sz="4"/>
+              <w:left w:val="single" w:color="CCCCCC" w:sz="4"/>
+              <w:bottom w:val="single" w:color="CCCCCC" w:sz="4"/>
+              <w:right w:val="single" w:color="CCCCCC" w:sz="4"/>
+            </w:tcBorders>
+            <w:tcMar>
+              <w:top w:type="dxa" w:w="100"/>
+              <w:left w:type="dxa" w:w="120"/>
+              <w:bottom w:type="dxa" w:w="100"/>
+              <w:right w:type="dxa" w:w="120"/>
+            </w:tcMar>
+            <w:vAlign w:val="center"/>
+          </w:tcPr>
+          <w:p>
+            <w:pPr>
+              <w:jc w:val="left"/>
+            </w:pPr>
+            <w:r>
+              <w:rPr>
+                <w:b/>
+                <w:bCs/>
+                <w:i w:val="false"/>
+                <w:iCs w:val="false"/>
+                <w:sz w:val="19"/>
+                <w:szCs w:val="19"/>
+              </w:rPr>
+              <w:t xml:space="preserve">Leaflet</w:t>
+            </w:r>
+          </w:p>
+        </w:tc>
+        <w:tc>
+          <w:tcPr>
+            <w:tcW w:type="dxa" w:w="1500"/>
+            <w:tcBorders>
+              <w:top w:val="single" w:color="CCCCCC" w:sz="4"/>
+              <w:left w:val="single" w:color="CCCCCC" w:sz="4"/>
+              <w:bottom w:val="single" w:color="CCCCCC" w:sz="4"/>
+              <w:right w:val="single" w:color="CCCCCC" w:sz="4"/>
+            </w:tcBorders>
+            <w:tcMar>
+              <w:top w:type="dxa" w:w="100"/>
+              <w:left w:type="dxa" w:w="120"/>
+              <w:bottom w:type="dxa" w:w="100"/>
+              <w:right w:type="dxa" w:w="120"/>
+            </w:tcMar>
+            <w:vAlign w:val="center"/>
+          </w:tcPr>
+          <w:p>
+            <w:pPr>
+              <w:jc w:val="left"/>
+            </w:pPr>
+            <w:r>
+              <w:rPr>
+                <w:b w:val="false"/>
+                <w:bCs w:val="false"/>
+                <w:i w:val="false"/>
+                <w:iCs w:val="false"/>
+                <w:color w:val="4A6A8A"/>
+                <w:sz w:val="19"/>
+                <w:szCs w:val="19"/>
+              </w:rPr>
+              <w:t xml:space="preserve">Tecnologia</w:t>
+            </w:r>
+          </w:p>
+        </w:tc>
+        <w:tc>
+          <w:tcPr>
+            <w:tcW w:type="dxa" w:w="5760"/>
+            <w:tcBorders>
+              <w:top w:val="single" w:color="CCCCCC" w:sz="4"/>
+              <w:left w:val="single" w:color="CCCCCC" w:sz="4"/>
+              <w:bottom w:val="single" w:color="CCCCCC" w:sz="4"/>
+              <w:right w:val="single" w:color="CCCCCC" w:sz="4"/>
+            </w:tcBorders>
+            <w:tcMar>
+              <w:top w:type="dxa" w:w="100"/>
+              <w:left w:type="dxa" w:w="120"/>
+              <w:bottom w:type="dxa" w:w="100"/>
+              <w:right w:type="dxa" w:w="120"/>
+            </w:tcMar>
+            <w:vAlign w:val="center"/>
+          </w:tcPr>
+          <w:p>
+            <w:pPr>
+              <w:jc w:val="left"/>
+            </w:pPr>
+            <w:r>
+              <w:rPr>
+                <w:b w:val="false"/>
+                <w:bCs w:val="false"/>
+                <w:i w:val="false"/>
+                <w:iCs w:val="false"/>
+                <w:sz w:val="19"/>
+                <w:szCs w:val="19"/>
+              </w:rPr>
+              <w:t xml:space="preserve">Biblioteca JavaScript de mapa interativo (v1.9.4, via CDN); renderiza o mapa de fluxos com tiles CARTO Voyager, usada junto com D3.js.</w:t>
+            </w:r>
+          </w:p>
+        </w:tc>
+      </w:tr>
+      <w:tr>
+        <w:tc>
+          <w:tcPr>
+            <w:tcW w:type="dxa" w:w="2100"/>
+            <w:tcBorders>
+              <w:top w:val="single" w:color="CCCCCC" w:sz="4"/>
+              <w:left w:val="single" w:color="CCCCCC" w:sz="4"/>
+              <w:bottom w:val="single" w:color="CCCCCC" w:sz="4"/>
+              <w:right w:val="single" w:color="CCCCCC" w:sz="4"/>
+            </w:tcBorders>
+            <w:tcMar>
+              <w:top w:type="dxa" w:w="100"/>
+              <w:left w:type="dxa" w:w="120"/>
+              <w:bottom w:type="dxa" w:w="100"/>
+              <w:right w:type="dxa" w:w="120"/>
+            </w:tcMar>
+            <w:vAlign w:val="center"/>
+          </w:tcPr>
+          <w:p>
+            <w:pPr>
+              <w:jc w:val="left"/>
+            </w:pPr>
+            <w:r>
+              <w:rPr>
+                <w:b/>
+                <w:bCs/>
+                <w:i w:val="false"/>
+                <w:iCs w:val="false"/>
+                <w:sz w:val="19"/>
+                <w:szCs w:val="19"/>
+              </w:rPr>
+              <w:t xml:space="preserve">MVNO / MNO</w:t>
+            </w:r>
+          </w:p>
+        </w:tc>
+        <w:tc>
+          <w:tcPr>
+            <w:tcW w:type="dxa" w:w="1500"/>
+            <w:tcBorders>
+              <w:top w:val="single" w:color="CCCCCC" w:sz="4"/>
+              <w:left w:val="single" w:color="CCCCCC" w:sz="4"/>
+              <w:bottom w:val="single" w:color="CCCCCC" w:sz="4"/>
+              <w:right w:val="single" w:color="CCCCCC" w:sz="4"/>
+            </w:tcBorders>
+            <w:tcMar>
+              <w:top w:type="dxa" w:w="100"/>
+              <w:left w:type="dxa" w:w="120"/>
+              <w:bottom w:type="dxa" w:w="100"/>
+              <w:right w:type="dxa" w:w="120"/>
+            </w:tcMar>
+            <w:vAlign w:val="center"/>
+          </w:tcPr>
+          <w:p>
+            <w:pPr>
+              <w:jc w:val="left"/>
+            </w:pPr>
+            <w:r>
+              <w:rPr>
+                <w:b w:val="false"/>
+                <w:bCs w:val="false"/>
+                <w:i w:val="false"/>
+                <w:iCs w:val="false"/>
+                <w:color w:val="4A6A8A"/>
+                <w:sz w:val="19"/>
+                <w:szCs w:val="19"/>
+              </w:rPr>
+              <w:t xml:space="preserve">Sigla</w:t>
+            </w:r>
+          </w:p>
+        </w:tc>
+        <w:tc>
+          <w:tcPr>
+            <w:tcW w:type="dxa" w:w="5760"/>
+            <w:tcBorders>
+              <w:top w:val="single" w:color="CCCCCC" w:sz="4"/>
+              <w:left w:val="single" w:color="CCCCCC" w:sz="4"/>
+              <w:bottom w:val="single" w:color="CCCCCC" w:sz="4"/>
+              <w:right w:val="single" w:color="CCCCCC" w:sz="4"/>
+            </w:tcBorders>
+            <w:tcMar>
+              <w:top w:type="dxa" w:w="100"/>
+              <w:left w:type="dxa" w:w="120"/>
+              <w:bottom w:type="dxa" w:w="100"/>
+              <w:right w:type="dxa" w:w="120"/>
+            </w:tcMar>
+            <w:vAlign w:val="center"/>
+          </w:tcPr>
+          <w:p>
+            <w:pPr>
+              <w:jc w:val="left"/>
+            </w:pPr>
+            <w:r>
+              <w:rPr>
+                <w:b w:val="false"/>
+                <w:bCs w:val="false"/>
+                <w:i w:val="false"/>
+                <w:iCs w:val="false"/>
+                <w:sz w:val="19"/>
+                <w:szCs w:val="19"/>
+              </w:rPr>
+              <w:t xml:space="preserve">Mobile Virtual Network Operator / Mobile Network Operator — operadoras móveis regionais às quais o StepGraph se destina como MVP de visualização de mobilidade.</w:t>
+            </w:r>
+          </w:p>
+        </w:tc>
+      </w:tr>
+      <w:tr>
+        <w:tc>
+          <w:tcPr>
+            <w:tcW w:type="dxa" w:w="2100"/>
+            <w:tcBorders>
+              <w:top w:val="single" w:color="CCCCCC" w:sz="4"/>
+              <w:left w:val="single" w:color="CCCCCC" w:sz="4"/>
+              <w:bottom w:val="single" w:color="CCCCCC" w:sz="4"/>
+              <w:right w:val="single" w:color="CCCCCC" w:sz="4"/>
+            </w:tcBorders>
+            <w:tcMar>
+              <w:top w:type="dxa" w:w="100"/>
+              <w:left w:type="dxa" w:w="120"/>
+              <w:bottom w:type="dxa" w:w="100"/>
+              <w:right w:type="dxa" w:w="120"/>
+            </w:tcMar>
+            <w:vAlign w:val="center"/>
+          </w:tcPr>
+          <w:p>
+            <w:pPr>
+              <w:jc w:val="left"/>
+            </w:pPr>
+            <w:r>
+              <w:rPr>
+                <w:b/>
+                <w:bCs/>
+                <w:i w:val="false"/>
+                <w:iCs w:val="false"/>
+                <w:sz w:val="19"/>
+                <w:szCs w:val="19"/>
+              </w:rPr>
+              <w:t xml:space="preserve">MVP</w:t>
+            </w:r>
+          </w:p>
+        </w:tc>
+        <w:tc>
+          <w:tcPr>
+            <w:tcW w:type="dxa" w:w="1500"/>
+            <w:tcBorders>
+              <w:top w:val="single" w:color="CCCCCC" w:sz="4"/>
+              <w:left w:val="single" w:color="CCCCCC" w:sz="4"/>
+              <w:bottom w:val="single" w:color="CCCCCC" w:sz="4"/>
+              <w:right w:val="single" w:color="CCCCCC" w:sz="4"/>
+            </w:tcBorders>
+            <w:tcMar>
+              <w:top w:type="dxa" w:w="100"/>
+              <w:left w:type="dxa" w:w="120"/>
+              <w:bottom w:type="dxa" w:w="100"/>
+              <w:right w:type="dxa" w:w="120"/>
+            </w:tcMar>
+            <w:vAlign w:val="center"/>
+          </w:tcPr>
+          <w:p>
+            <w:pPr>
+              <w:jc w:val="left"/>
+            </w:pPr>
+            <w:r>
+              <w:rPr>
+                <w:b w:val="false"/>
+                <w:bCs w:val="false"/>
+                <w:i w:val="false"/>
+                <w:iCs w:val="false"/>
+                <w:color w:val="4A6A8A"/>
+                <w:sz w:val="19"/>
+                <w:szCs w:val="19"/>
+              </w:rPr>
+              <w:t xml:space="preserve">Sigla</w:t>
+            </w:r>
+          </w:p>
+        </w:tc>
+        <w:tc>
+          <w:tcPr>
+            <w:tcW w:type="dxa" w:w="5760"/>
+            <w:tcBorders>
+              <w:top w:val="single" w:color="CCCCCC" w:sz="4"/>
+              <w:left w:val="single" w:color="CCCCCC" w:sz="4"/>
+              <w:bottom w:val="single" w:color="CCCCCC" w:sz="4"/>
+              <w:right w:val="single" w:color="CCCCCC" w:sz="4"/>
+            </w:tcBorders>
+            <w:tcMar>
+              <w:top w:type="dxa" w:w="100"/>
+              <w:left w:type="dxa" w:w="120"/>
+              <w:bottom w:type="dxa" w:w="100"/>
+              <w:right w:type="dxa" w:w="120"/>
+            </w:tcMar>
+            <w:vAlign w:val="center"/>
+          </w:tcPr>
+          <w:p>
+            <w:pPr>
+              <w:jc w:val="left"/>
+            </w:pPr>
+            <w:r>
+              <w:rPr>
+                <w:b w:val="false"/>
+                <w:bCs w:val="false"/>
+                <w:i w:val="false"/>
+                <w:iCs w:val="false"/>
+                <w:sz w:val="19"/>
+                <w:szCs w:val="19"/>
+              </w:rPr>
+              <w:t xml:space="preserve">Minimum Viable Product — descreve o escopo desta versão do StepGraph presente no repositório, distinta da versão externa StepGraph MNO Edition.</w:t>
             </w:r>
           </w:p>
         </w:tc>

</xml_diff>